<commit_message>
Ajustes en la primera entrega
</commit_message>
<xml_diff>
--- a/Segundo entregable/G1_Modelo dimensional y diseño ETL.docx
+++ b/Segundo entregable/G1_Modelo dimensional y diseño ETL.docx
@@ -3762,26 +3762,6 @@
         </w:rPr>
         <w:t xml:space="preserve"> y deja una estructura flexible para incorporar nuevos atributos o dimensiones en el futuro. Su diseño conserva el detalle necesario para el análisis histórico, facilita la construcción de tableros de control y apoya la toma de decisiones relacionadas con la supervisión de la oferta de planes de salud.</w:t>
       </w:r>
-    </w:p>
-    <w:p>
-      <w:pPr>
-        <w:jc w:val="both"/>
-        <w:rPr>
-          <w:rFonts w:ascii="Arial" w:hAnsi="Arial" w:cs="Arial"/>
-          <w:color w:val="000000" w:themeColor="text1"/>
-          <w:lang w:val="es-CO"/>
-        </w:rPr>
-      </w:pPr>
-    </w:p>
-    <w:p>
-      <w:pPr>
-        <w:jc w:val="both"/>
-        <w:rPr>
-          <w:rFonts w:ascii="Arial" w:hAnsi="Arial" w:cs="Arial"/>
-          <w:color w:val="000000" w:themeColor="text1"/>
-          <w:lang w:val="es-CO"/>
-        </w:rPr>
-      </w:pPr>
     </w:p>
     <w:p>
       <w:pPr>

</xml_diff>

<commit_message>
Adición de pasos de ETL
</commit_message>
<xml_diff>
--- a/Segundo entregable/G1_Modelo dimensional y diseño ETL.docx
+++ b/Segundo entregable/G1_Modelo dimensional y diseño ETL.docx
@@ -1,6 +1,6 @@
 
 <file path=word/document.xml><?xml version="1.0" encoding="utf-8"?>
-<w:document xmlns:wpc="http://schemas.microsoft.com/office/word/2010/wordprocessingCanvas" xmlns:cx="http://schemas.microsoft.com/office/drawing/2014/chartex" xmlns:cx1="http://schemas.microsoft.com/office/drawing/2015/9/8/chartex" xmlns:cx2="http://schemas.microsoft.com/office/drawing/2015/10/21/chartex" xmlns:cx3="http://schemas.microsoft.com/office/drawing/2016/5/9/chartex" xmlns:cx4="http://schemas.microsoft.com/office/drawing/2016/5/10/chartex" xmlns:cx5="http://schemas.microsoft.com/office/drawing/2016/5/11/chartex" xmlns:cx6="http://schemas.microsoft.com/office/drawing/2016/5/12/chartex" xmlns:cx7="http://schemas.microsoft.com/office/drawing/2016/5/13/chartex" xmlns:cx8="http://schemas.microsoft.com/office/drawing/2016/5/14/chartex" xmlns:mc="http://schemas.openxmlformats.org/markup-compatibility/2006" xmlns:aink="http://schemas.microsoft.com/office/drawing/2016/ink" xmlns:am3d="http://schemas.microsoft.com/office/drawing/2017/model3d" xmlns:o="urn:schemas-microsoft-com:office:office" xmlns:r="http://schemas.openxmlformats.org/officeDocument/2006/relationships" xmlns:m="http://schemas.openxmlformats.org/officeDocument/2006/math" xmlns:v="urn:schemas-microsoft-com:vml" xmlns:wp14="http://schemas.microsoft.com/office/word/2010/wordprocessingDrawing" xmlns:wp="http://schemas.openxmlformats.org/drawingml/2006/wordprocessingDrawing" xmlns:w10="urn:schemas-microsoft-com:office:word" xmlns:w="http://schemas.openxmlformats.org/wordprocessingml/2006/main" xmlns:w14="http://schemas.microsoft.com/office/word/2010/wordml" xmlns:w15="http://schemas.microsoft.com/office/word/2012/wordml" xmlns:w16cex="http://schemas.microsoft.com/office/word/2018/wordml/cex" xmlns:w16cid="http://schemas.microsoft.com/office/word/2016/wordml/cid" xmlns:w16="http://schemas.microsoft.com/office/word/2018/wordml" xmlns:w16sdtdh="http://schemas.microsoft.com/office/word/2020/wordml/sdtdatahash" xmlns:w16se="http://schemas.microsoft.com/office/word/2015/wordml/symex" xmlns:wpg="http://schemas.microsoft.com/office/word/2010/wordprocessingGroup" xmlns:wpi="http://schemas.microsoft.com/office/word/2010/wordprocessingInk" xmlns:wne="http://schemas.microsoft.com/office/word/2006/wordml" xmlns:wps="http://schemas.microsoft.com/office/word/2010/wordprocessingShape" mc:Ignorable="w14 w15 w16se w16cid w16 w16cex w16sdtdh wp14">
+<w:document xmlns:wpc="http://schemas.microsoft.com/office/word/2010/wordprocessingCanvas" xmlns:cx="http://schemas.microsoft.com/office/drawing/2014/chartex" xmlns:cx1="http://schemas.microsoft.com/office/drawing/2015/9/8/chartex" xmlns:cx2="http://schemas.microsoft.com/office/drawing/2015/10/21/chartex" xmlns:cx3="http://schemas.microsoft.com/office/drawing/2016/5/9/chartex" xmlns:cx4="http://schemas.microsoft.com/office/drawing/2016/5/10/chartex" xmlns:cx5="http://schemas.microsoft.com/office/drawing/2016/5/11/chartex" xmlns:cx6="http://schemas.microsoft.com/office/drawing/2016/5/12/chartex" xmlns:cx7="http://schemas.microsoft.com/office/drawing/2016/5/13/chartex" xmlns:cx8="http://schemas.microsoft.com/office/drawing/2016/5/14/chartex" xmlns:mc="http://schemas.openxmlformats.org/markup-compatibility/2006" xmlns:aink="http://schemas.microsoft.com/office/drawing/2016/ink" xmlns:am3d="http://schemas.microsoft.com/office/drawing/2017/model3d" xmlns:o="urn:schemas-microsoft-com:office:office" xmlns:oel="http://schemas.microsoft.com/office/2019/extlst" xmlns:r="http://schemas.openxmlformats.org/officeDocument/2006/relationships" xmlns:m="http://schemas.openxmlformats.org/officeDocument/2006/math" xmlns:v="urn:schemas-microsoft-com:vml" xmlns:wp14="http://schemas.microsoft.com/office/word/2010/wordprocessingDrawing" xmlns:wp="http://schemas.openxmlformats.org/drawingml/2006/wordprocessingDrawing" xmlns:w10="urn:schemas-microsoft-com:office:word" xmlns:w="http://schemas.openxmlformats.org/wordprocessingml/2006/main" xmlns:w14="http://schemas.microsoft.com/office/word/2010/wordml" xmlns:w15="http://schemas.microsoft.com/office/word/2012/wordml" xmlns:w16cex="http://schemas.microsoft.com/office/word/2018/wordml/cex" xmlns:w16cid="http://schemas.microsoft.com/office/word/2016/wordml/cid" xmlns:w16="http://schemas.microsoft.com/office/word/2018/wordml" xmlns:w16du="http://schemas.microsoft.com/office/word/2023/wordml/word16du" xmlns:w16sdtdh="http://schemas.microsoft.com/office/word/2020/wordml/sdtdatahash" xmlns:w16sdtfl="http://schemas.microsoft.com/office/word/2024/wordml/sdtformatlock" xmlns:w16se="http://schemas.microsoft.com/office/word/2015/wordml/symex" xmlns:wpg="http://schemas.microsoft.com/office/word/2010/wordprocessingGroup" xmlns:wpi="http://schemas.microsoft.com/office/word/2010/wordprocessingInk" xmlns:wne="http://schemas.microsoft.com/office/word/2006/wordml" xmlns:wps="http://schemas.microsoft.com/office/word/2010/wordprocessingShape" mc:Ignorable="w14 w15 w16se w16cid w16 w16cex w16sdtdh w16sdtfl w16du wp14">
   <w:body>
     <w:p>
       <w:pPr>
@@ -361,7 +361,6 @@
         </w:rPr>
         <w:t xml:space="preserve">Salvatore </w:t>
       </w:r>
-      <w:proofErr w:type="spellStart"/>
       <w:r>
         <w:rPr>
           <w:rFonts w:ascii="Arial" w:hAnsi="Arial" w:cs="Arial"/>
@@ -370,7 +369,6 @@
         </w:rPr>
         <w:t>Cucina</w:t>
       </w:r>
-      <w:proofErr w:type="spellEnd"/>
       <w:r>
         <w:rPr>
           <w:rFonts w:ascii="Arial" w:hAnsi="Arial" w:cs="Arial"/>
@@ -1859,7 +1857,49 @@
           <w:szCs w:val="22"/>
           <w:lang w:val="es-CO"/>
         </w:rPr>
-        <w:t xml:space="preserve">La granularidad de la tabla de hechos corresponde a un tipo de beneficio ofrecido dentro de un plan, por un proveedor, en un área de servicio y en una fecha determinada. Esta granularidad permite analizar de forma detallada los valores de copago, </w:t>
+        <w:t xml:space="preserve">La granularidad de la tabla de hechos corresponde a </w:t>
+      </w:r>
+      <w:r>
+        <w:rPr>
+          <w:rFonts w:ascii="Arial" w:hAnsi="Arial" w:cs="Arial"/>
+          <w:color w:val="000000" w:themeColor="text1"/>
+          <w:sz w:val="22"/>
+          <w:szCs w:val="22"/>
+          <w:lang w:val="es-CO"/>
+        </w:rPr>
+        <w:t xml:space="preserve">el valor del copago, </w:t>
+      </w:r>
+      <w:proofErr w:type="spellStart"/>
+      <w:r>
+        <w:rPr>
+          <w:rFonts w:ascii="Arial" w:hAnsi="Arial" w:cs="Arial"/>
+          <w:color w:val="000000" w:themeColor="text1"/>
+          <w:sz w:val="22"/>
+          <w:szCs w:val="22"/>
+          <w:lang w:val="es-CO"/>
+        </w:rPr>
+        <w:t>coseguro</w:t>
+      </w:r>
+      <w:proofErr w:type="spellEnd"/>
+      <w:r>
+        <w:rPr>
+          <w:rFonts w:ascii="Arial" w:hAnsi="Arial" w:cs="Arial"/>
+          <w:color w:val="000000" w:themeColor="text1"/>
+          <w:sz w:val="22"/>
+          <w:szCs w:val="22"/>
+          <w:lang w:val="es-CO"/>
+        </w:rPr>
+        <w:t xml:space="preserve"> y cantidad limite ofrecido por </w:t>
+      </w:r>
+      <w:r>
+        <w:rPr>
+          <w:rFonts w:ascii="Arial" w:hAnsi="Arial" w:cs="Arial"/>
+          <w:color w:val="000000" w:themeColor="text1"/>
+          <w:sz w:val="22"/>
+          <w:szCs w:val="22"/>
+          <w:lang w:val="es-CO"/>
+        </w:rPr>
+        <w:t xml:space="preserve">un tipo de beneficio dentro de un plan, por un proveedor, en un área de servicio y en una fecha determinada. Esta granularidad permite analizar de forma detallada los valores de copago, </w:t>
       </w:r>
       <w:proofErr w:type="spellStart"/>
       <w:r>
@@ -3808,7 +3848,7 @@
 </file>
 
 <file path=word/endnotes.xml><?xml version="1.0" encoding="utf-8"?>
-<w:endnotes xmlns:wpc="http://schemas.microsoft.com/office/word/2010/wordprocessingCanvas" xmlns:cx="http://schemas.microsoft.com/office/drawing/2014/chartex" xmlns:cx1="http://schemas.microsoft.com/office/drawing/2015/9/8/chartex" xmlns:cx2="http://schemas.microsoft.com/office/drawing/2015/10/21/chartex" xmlns:cx3="http://schemas.microsoft.com/office/drawing/2016/5/9/chartex" xmlns:cx4="http://schemas.microsoft.com/office/drawing/2016/5/10/chartex" xmlns:cx5="http://schemas.microsoft.com/office/drawing/2016/5/11/chartex" xmlns:cx6="http://schemas.microsoft.com/office/drawing/2016/5/12/chartex" xmlns:cx7="http://schemas.microsoft.com/office/drawing/2016/5/13/chartex" xmlns:cx8="http://schemas.microsoft.com/office/drawing/2016/5/14/chartex" xmlns:mc="http://schemas.openxmlformats.org/markup-compatibility/2006" xmlns:aink="http://schemas.microsoft.com/office/drawing/2016/ink" xmlns:am3d="http://schemas.microsoft.com/office/drawing/2017/model3d" xmlns:o="urn:schemas-microsoft-com:office:office" xmlns:r="http://schemas.openxmlformats.org/officeDocument/2006/relationships" xmlns:m="http://schemas.openxmlformats.org/officeDocument/2006/math" xmlns:v="urn:schemas-microsoft-com:vml" xmlns:wp14="http://schemas.microsoft.com/office/word/2010/wordprocessingDrawing" xmlns:wp="http://schemas.openxmlformats.org/drawingml/2006/wordprocessingDrawing" xmlns:w10="urn:schemas-microsoft-com:office:word" xmlns:w="http://schemas.openxmlformats.org/wordprocessingml/2006/main" xmlns:w14="http://schemas.microsoft.com/office/word/2010/wordml" xmlns:w15="http://schemas.microsoft.com/office/word/2012/wordml" xmlns:w16cex="http://schemas.microsoft.com/office/word/2018/wordml/cex" xmlns:w16cid="http://schemas.microsoft.com/office/word/2016/wordml/cid" xmlns:w16="http://schemas.microsoft.com/office/word/2018/wordml" xmlns:w16sdtdh="http://schemas.microsoft.com/office/word/2020/wordml/sdtdatahash" xmlns:w16se="http://schemas.microsoft.com/office/word/2015/wordml/symex" xmlns:wpg="http://schemas.microsoft.com/office/word/2010/wordprocessingGroup" xmlns:wpi="http://schemas.microsoft.com/office/word/2010/wordprocessingInk" xmlns:wne="http://schemas.microsoft.com/office/word/2006/wordml" xmlns:wps="http://schemas.microsoft.com/office/word/2010/wordprocessingShape" mc:Ignorable="w14 w15 w16se w16cid w16 w16cex w16sdtdh wp14">
+<w:endnotes xmlns:wpc="http://schemas.microsoft.com/office/word/2010/wordprocessingCanvas" xmlns:cx="http://schemas.microsoft.com/office/drawing/2014/chartex" xmlns:cx1="http://schemas.microsoft.com/office/drawing/2015/9/8/chartex" xmlns:cx2="http://schemas.microsoft.com/office/drawing/2015/10/21/chartex" xmlns:cx3="http://schemas.microsoft.com/office/drawing/2016/5/9/chartex" xmlns:cx4="http://schemas.microsoft.com/office/drawing/2016/5/10/chartex" xmlns:cx5="http://schemas.microsoft.com/office/drawing/2016/5/11/chartex" xmlns:cx6="http://schemas.microsoft.com/office/drawing/2016/5/12/chartex" xmlns:cx7="http://schemas.microsoft.com/office/drawing/2016/5/13/chartex" xmlns:cx8="http://schemas.microsoft.com/office/drawing/2016/5/14/chartex" xmlns:mc="http://schemas.openxmlformats.org/markup-compatibility/2006" xmlns:aink="http://schemas.microsoft.com/office/drawing/2016/ink" xmlns:am3d="http://schemas.microsoft.com/office/drawing/2017/model3d" xmlns:o="urn:schemas-microsoft-com:office:office" xmlns:oel="http://schemas.microsoft.com/office/2019/extlst" xmlns:r="http://schemas.openxmlformats.org/officeDocument/2006/relationships" xmlns:m="http://schemas.openxmlformats.org/officeDocument/2006/math" xmlns:v="urn:schemas-microsoft-com:vml" xmlns:wp14="http://schemas.microsoft.com/office/word/2010/wordprocessingDrawing" xmlns:wp="http://schemas.openxmlformats.org/drawingml/2006/wordprocessingDrawing" xmlns:w10="urn:schemas-microsoft-com:office:word" xmlns:w="http://schemas.openxmlformats.org/wordprocessingml/2006/main" xmlns:w14="http://schemas.microsoft.com/office/word/2010/wordml" xmlns:w15="http://schemas.microsoft.com/office/word/2012/wordml" xmlns:w16cex="http://schemas.microsoft.com/office/word/2018/wordml/cex" xmlns:w16cid="http://schemas.microsoft.com/office/word/2016/wordml/cid" xmlns:w16="http://schemas.microsoft.com/office/word/2018/wordml" xmlns:w16du="http://schemas.microsoft.com/office/word/2023/wordml/word16du" xmlns:w16sdtdh="http://schemas.microsoft.com/office/word/2020/wordml/sdtdatahash" xmlns:w16sdtfl="http://schemas.microsoft.com/office/word/2024/wordml/sdtformatlock" xmlns:w16se="http://schemas.microsoft.com/office/word/2015/wordml/symex" xmlns:wpg="http://schemas.microsoft.com/office/word/2010/wordprocessingGroup" xmlns:wpi="http://schemas.microsoft.com/office/word/2010/wordprocessingInk" xmlns:wne="http://schemas.microsoft.com/office/word/2006/wordml" xmlns:wps="http://schemas.microsoft.com/office/word/2010/wordprocessingShape" mc:Ignorable="w14 w15 w16se w16cid w16 w16cex w16sdtdh w16sdtfl w16du wp14">
   <w:endnote w:type="separator" w:id="-1">
     <w:p>
       <w:pPr>
@@ -3833,7 +3873,7 @@
 </file>
 
 <file path=word/footer1.xml><?xml version="1.0" encoding="utf-8"?>
-<w:ftr xmlns:wpc="http://schemas.microsoft.com/office/word/2010/wordprocessingCanvas" xmlns:cx="http://schemas.microsoft.com/office/drawing/2014/chartex" xmlns:cx1="http://schemas.microsoft.com/office/drawing/2015/9/8/chartex" xmlns:cx2="http://schemas.microsoft.com/office/drawing/2015/10/21/chartex" xmlns:cx3="http://schemas.microsoft.com/office/drawing/2016/5/9/chartex" xmlns:cx4="http://schemas.microsoft.com/office/drawing/2016/5/10/chartex" xmlns:cx5="http://schemas.microsoft.com/office/drawing/2016/5/11/chartex" xmlns:cx6="http://schemas.microsoft.com/office/drawing/2016/5/12/chartex" xmlns:cx7="http://schemas.microsoft.com/office/drawing/2016/5/13/chartex" xmlns:cx8="http://schemas.microsoft.com/office/drawing/2016/5/14/chartex" xmlns:mc="http://schemas.openxmlformats.org/markup-compatibility/2006" xmlns:aink="http://schemas.microsoft.com/office/drawing/2016/ink" xmlns:am3d="http://schemas.microsoft.com/office/drawing/2017/model3d" xmlns:o="urn:schemas-microsoft-com:office:office" xmlns:r="http://schemas.openxmlformats.org/officeDocument/2006/relationships" xmlns:m="http://schemas.openxmlformats.org/officeDocument/2006/math" xmlns:v="urn:schemas-microsoft-com:vml" xmlns:wp14="http://schemas.microsoft.com/office/word/2010/wordprocessingDrawing" xmlns:wp="http://schemas.openxmlformats.org/drawingml/2006/wordprocessingDrawing" xmlns:w10="urn:schemas-microsoft-com:office:word" xmlns:w="http://schemas.openxmlformats.org/wordprocessingml/2006/main" xmlns:w14="http://schemas.microsoft.com/office/word/2010/wordml" xmlns:w15="http://schemas.microsoft.com/office/word/2012/wordml" xmlns:w16cex="http://schemas.microsoft.com/office/word/2018/wordml/cex" xmlns:w16cid="http://schemas.microsoft.com/office/word/2016/wordml/cid" xmlns:w16="http://schemas.microsoft.com/office/word/2018/wordml" xmlns:w16sdtdh="http://schemas.microsoft.com/office/word/2020/wordml/sdtdatahash" xmlns:w16se="http://schemas.microsoft.com/office/word/2015/wordml/symex" xmlns:wpg="http://schemas.microsoft.com/office/word/2010/wordprocessingGroup" xmlns:wpi="http://schemas.microsoft.com/office/word/2010/wordprocessingInk" xmlns:wne="http://schemas.microsoft.com/office/word/2006/wordml" xmlns:wps="http://schemas.microsoft.com/office/word/2010/wordprocessingShape" mc:Ignorable="w14 w15 w16se w16cid w16 w16cex w16sdtdh wp14">
+<w:ftr xmlns:wpc="http://schemas.microsoft.com/office/word/2010/wordprocessingCanvas" xmlns:cx="http://schemas.microsoft.com/office/drawing/2014/chartex" xmlns:cx1="http://schemas.microsoft.com/office/drawing/2015/9/8/chartex" xmlns:cx2="http://schemas.microsoft.com/office/drawing/2015/10/21/chartex" xmlns:cx3="http://schemas.microsoft.com/office/drawing/2016/5/9/chartex" xmlns:cx4="http://schemas.microsoft.com/office/drawing/2016/5/10/chartex" xmlns:cx5="http://schemas.microsoft.com/office/drawing/2016/5/11/chartex" xmlns:cx6="http://schemas.microsoft.com/office/drawing/2016/5/12/chartex" xmlns:cx7="http://schemas.microsoft.com/office/drawing/2016/5/13/chartex" xmlns:cx8="http://schemas.microsoft.com/office/drawing/2016/5/14/chartex" xmlns:mc="http://schemas.openxmlformats.org/markup-compatibility/2006" xmlns:aink="http://schemas.microsoft.com/office/drawing/2016/ink" xmlns:am3d="http://schemas.microsoft.com/office/drawing/2017/model3d" xmlns:o="urn:schemas-microsoft-com:office:office" xmlns:oel="http://schemas.microsoft.com/office/2019/extlst" xmlns:r="http://schemas.openxmlformats.org/officeDocument/2006/relationships" xmlns:m="http://schemas.openxmlformats.org/officeDocument/2006/math" xmlns:v="urn:schemas-microsoft-com:vml" xmlns:wp14="http://schemas.microsoft.com/office/word/2010/wordprocessingDrawing" xmlns:wp="http://schemas.openxmlformats.org/drawingml/2006/wordprocessingDrawing" xmlns:w10="urn:schemas-microsoft-com:office:word" xmlns:w="http://schemas.openxmlformats.org/wordprocessingml/2006/main" xmlns:w14="http://schemas.microsoft.com/office/word/2010/wordml" xmlns:w15="http://schemas.microsoft.com/office/word/2012/wordml" xmlns:w16cex="http://schemas.microsoft.com/office/word/2018/wordml/cex" xmlns:w16cid="http://schemas.microsoft.com/office/word/2016/wordml/cid" xmlns:w16="http://schemas.microsoft.com/office/word/2018/wordml" xmlns:w16du="http://schemas.microsoft.com/office/word/2023/wordml/word16du" xmlns:w16sdtdh="http://schemas.microsoft.com/office/word/2020/wordml/sdtdatahash" xmlns:w16sdtfl="http://schemas.microsoft.com/office/word/2024/wordml/sdtformatlock" xmlns:w16se="http://schemas.microsoft.com/office/word/2015/wordml/symex" xmlns:wpg="http://schemas.microsoft.com/office/word/2010/wordprocessingGroup" xmlns:wpi="http://schemas.microsoft.com/office/word/2010/wordprocessingInk" xmlns:wne="http://schemas.microsoft.com/office/word/2006/wordml" xmlns:wps="http://schemas.microsoft.com/office/word/2010/wordprocessingShape" mc:Ignorable="w14 w15 w16se w16cid w16 w16cex w16sdtdh w16sdtfl w16du wp14">
   <w:sdt>
     <w:sdtPr>
       <w:id w:val="660974124"/>
@@ -3842,7 +3882,6 @@
         <w:docPartUnique/>
       </w:docPartObj>
     </w:sdtPr>
-    <w:sdtEndPr/>
     <w:sdtContent>
       <w:p>
         <w:pPr>
@@ -3879,7 +3918,7 @@
 </file>
 
 <file path=word/footnotes.xml><?xml version="1.0" encoding="utf-8"?>
-<w:footnotes xmlns:wpc="http://schemas.microsoft.com/office/word/2010/wordprocessingCanvas" xmlns:cx="http://schemas.microsoft.com/office/drawing/2014/chartex" xmlns:cx1="http://schemas.microsoft.com/office/drawing/2015/9/8/chartex" xmlns:cx2="http://schemas.microsoft.com/office/drawing/2015/10/21/chartex" xmlns:cx3="http://schemas.microsoft.com/office/drawing/2016/5/9/chartex" xmlns:cx4="http://schemas.microsoft.com/office/drawing/2016/5/10/chartex" xmlns:cx5="http://schemas.microsoft.com/office/drawing/2016/5/11/chartex" xmlns:cx6="http://schemas.microsoft.com/office/drawing/2016/5/12/chartex" xmlns:cx7="http://schemas.microsoft.com/office/drawing/2016/5/13/chartex" xmlns:cx8="http://schemas.microsoft.com/office/drawing/2016/5/14/chartex" xmlns:mc="http://schemas.openxmlformats.org/markup-compatibility/2006" xmlns:aink="http://schemas.microsoft.com/office/drawing/2016/ink" xmlns:am3d="http://schemas.microsoft.com/office/drawing/2017/model3d" xmlns:o="urn:schemas-microsoft-com:office:office" xmlns:r="http://schemas.openxmlformats.org/officeDocument/2006/relationships" xmlns:m="http://schemas.openxmlformats.org/officeDocument/2006/math" xmlns:v="urn:schemas-microsoft-com:vml" xmlns:wp14="http://schemas.microsoft.com/office/word/2010/wordprocessingDrawing" xmlns:wp="http://schemas.openxmlformats.org/drawingml/2006/wordprocessingDrawing" xmlns:w10="urn:schemas-microsoft-com:office:word" xmlns:w="http://schemas.openxmlformats.org/wordprocessingml/2006/main" xmlns:w14="http://schemas.microsoft.com/office/word/2010/wordml" xmlns:w15="http://schemas.microsoft.com/office/word/2012/wordml" xmlns:w16cex="http://schemas.microsoft.com/office/word/2018/wordml/cex" xmlns:w16cid="http://schemas.microsoft.com/office/word/2016/wordml/cid" xmlns:w16="http://schemas.microsoft.com/office/word/2018/wordml" xmlns:w16sdtdh="http://schemas.microsoft.com/office/word/2020/wordml/sdtdatahash" xmlns:w16se="http://schemas.microsoft.com/office/word/2015/wordml/symex" xmlns:wpg="http://schemas.microsoft.com/office/word/2010/wordprocessingGroup" xmlns:wpi="http://schemas.microsoft.com/office/word/2010/wordprocessingInk" xmlns:wne="http://schemas.microsoft.com/office/word/2006/wordml" xmlns:wps="http://schemas.microsoft.com/office/word/2010/wordprocessingShape" mc:Ignorable="w14 w15 w16se w16cid w16 w16cex w16sdtdh wp14">
+<w:footnotes xmlns:wpc="http://schemas.microsoft.com/office/word/2010/wordprocessingCanvas" xmlns:cx="http://schemas.microsoft.com/office/drawing/2014/chartex" xmlns:cx1="http://schemas.microsoft.com/office/drawing/2015/9/8/chartex" xmlns:cx2="http://schemas.microsoft.com/office/drawing/2015/10/21/chartex" xmlns:cx3="http://schemas.microsoft.com/office/drawing/2016/5/9/chartex" xmlns:cx4="http://schemas.microsoft.com/office/drawing/2016/5/10/chartex" xmlns:cx5="http://schemas.microsoft.com/office/drawing/2016/5/11/chartex" xmlns:cx6="http://schemas.microsoft.com/office/drawing/2016/5/12/chartex" xmlns:cx7="http://schemas.microsoft.com/office/drawing/2016/5/13/chartex" xmlns:cx8="http://schemas.microsoft.com/office/drawing/2016/5/14/chartex" xmlns:mc="http://schemas.openxmlformats.org/markup-compatibility/2006" xmlns:aink="http://schemas.microsoft.com/office/drawing/2016/ink" xmlns:am3d="http://schemas.microsoft.com/office/drawing/2017/model3d" xmlns:o="urn:schemas-microsoft-com:office:office" xmlns:oel="http://schemas.microsoft.com/office/2019/extlst" xmlns:r="http://schemas.openxmlformats.org/officeDocument/2006/relationships" xmlns:m="http://schemas.openxmlformats.org/officeDocument/2006/math" xmlns:v="urn:schemas-microsoft-com:vml" xmlns:wp14="http://schemas.microsoft.com/office/word/2010/wordprocessingDrawing" xmlns:wp="http://schemas.openxmlformats.org/drawingml/2006/wordprocessingDrawing" xmlns:w10="urn:schemas-microsoft-com:office:word" xmlns:w="http://schemas.openxmlformats.org/wordprocessingml/2006/main" xmlns:w14="http://schemas.microsoft.com/office/word/2010/wordml" xmlns:w15="http://schemas.microsoft.com/office/word/2012/wordml" xmlns:w16cex="http://schemas.microsoft.com/office/word/2018/wordml/cex" xmlns:w16cid="http://schemas.microsoft.com/office/word/2016/wordml/cid" xmlns:w16="http://schemas.microsoft.com/office/word/2018/wordml" xmlns:w16du="http://schemas.microsoft.com/office/word/2023/wordml/word16du" xmlns:w16sdtdh="http://schemas.microsoft.com/office/word/2020/wordml/sdtdatahash" xmlns:w16sdtfl="http://schemas.microsoft.com/office/word/2024/wordml/sdtformatlock" xmlns:w16se="http://schemas.microsoft.com/office/word/2015/wordml/symex" xmlns:wpg="http://schemas.microsoft.com/office/word/2010/wordprocessingGroup" xmlns:wpi="http://schemas.microsoft.com/office/word/2010/wordprocessingInk" xmlns:wne="http://schemas.microsoft.com/office/word/2006/wordml" xmlns:wps="http://schemas.microsoft.com/office/word/2010/wordprocessingShape" mc:Ignorable="w14 w15 w16se w16cid w16 w16cex w16sdtdh w16sdtfl w16du wp14">
   <w:footnote w:type="separator" w:id="-1">
     <w:p>
       <w:pPr>
@@ -3904,7 +3943,7 @@
 </file>
 
 <file path=word/header1.xml><?xml version="1.0" encoding="utf-8"?>
-<w:hdr xmlns:wpc="http://schemas.microsoft.com/office/word/2010/wordprocessingCanvas" xmlns:cx="http://schemas.microsoft.com/office/drawing/2014/chartex" xmlns:cx1="http://schemas.microsoft.com/office/drawing/2015/9/8/chartex" xmlns:cx2="http://schemas.microsoft.com/office/drawing/2015/10/21/chartex" xmlns:cx3="http://schemas.microsoft.com/office/drawing/2016/5/9/chartex" xmlns:cx4="http://schemas.microsoft.com/office/drawing/2016/5/10/chartex" xmlns:cx5="http://schemas.microsoft.com/office/drawing/2016/5/11/chartex" xmlns:cx6="http://schemas.microsoft.com/office/drawing/2016/5/12/chartex" xmlns:cx7="http://schemas.microsoft.com/office/drawing/2016/5/13/chartex" xmlns:cx8="http://schemas.microsoft.com/office/drawing/2016/5/14/chartex" xmlns:mc="http://schemas.openxmlformats.org/markup-compatibility/2006" xmlns:aink="http://schemas.microsoft.com/office/drawing/2016/ink" xmlns:am3d="http://schemas.microsoft.com/office/drawing/2017/model3d" xmlns:o="urn:schemas-microsoft-com:office:office" xmlns:r="http://schemas.openxmlformats.org/officeDocument/2006/relationships" xmlns:m="http://schemas.openxmlformats.org/officeDocument/2006/math" xmlns:v="urn:schemas-microsoft-com:vml" xmlns:wp14="http://schemas.microsoft.com/office/word/2010/wordprocessingDrawing" xmlns:wp="http://schemas.openxmlformats.org/drawingml/2006/wordprocessingDrawing" xmlns:w10="urn:schemas-microsoft-com:office:word" xmlns:w="http://schemas.openxmlformats.org/wordprocessingml/2006/main" xmlns:w14="http://schemas.microsoft.com/office/word/2010/wordml" xmlns:w15="http://schemas.microsoft.com/office/word/2012/wordml" xmlns:w16cex="http://schemas.microsoft.com/office/word/2018/wordml/cex" xmlns:w16cid="http://schemas.microsoft.com/office/word/2016/wordml/cid" xmlns:w16="http://schemas.microsoft.com/office/word/2018/wordml" xmlns:w16sdtdh="http://schemas.microsoft.com/office/word/2020/wordml/sdtdatahash" xmlns:w16se="http://schemas.microsoft.com/office/word/2015/wordml/symex" xmlns:wpg="http://schemas.microsoft.com/office/word/2010/wordprocessingGroup" xmlns:wpi="http://schemas.microsoft.com/office/word/2010/wordprocessingInk" xmlns:wne="http://schemas.microsoft.com/office/word/2006/wordml" xmlns:wps="http://schemas.microsoft.com/office/word/2010/wordprocessingShape" mc:Ignorable="w14 w15 w16se w16cid w16 w16cex w16sdtdh wp14">
+<w:hdr xmlns:wpc="http://schemas.microsoft.com/office/word/2010/wordprocessingCanvas" xmlns:cx="http://schemas.microsoft.com/office/drawing/2014/chartex" xmlns:cx1="http://schemas.microsoft.com/office/drawing/2015/9/8/chartex" xmlns:cx2="http://schemas.microsoft.com/office/drawing/2015/10/21/chartex" xmlns:cx3="http://schemas.microsoft.com/office/drawing/2016/5/9/chartex" xmlns:cx4="http://schemas.microsoft.com/office/drawing/2016/5/10/chartex" xmlns:cx5="http://schemas.microsoft.com/office/drawing/2016/5/11/chartex" xmlns:cx6="http://schemas.microsoft.com/office/drawing/2016/5/12/chartex" xmlns:cx7="http://schemas.microsoft.com/office/drawing/2016/5/13/chartex" xmlns:cx8="http://schemas.microsoft.com/office/drawing/2016/5/14/chartex" xmlns:mc="http://schemas.openxmlformats.org/markup-compatibility/2006" xmlns:aink="http://schemas.microsoft.com/office/drawing/2016/ink" xmlns:am3d="http://schemas.microsoft.com/office/drawing/2017/model3d" xmlns:o="urn:schemas-microsoft-com:office:office" xmlns:oel="http://schemas.microsoft.com/office/2019/extlst" xmlns:r="http://schemas.openxmlformats.org/officeDocument/2006/relationships" xmlns:m="http://schemas.openxmlformats.org/officeDocument/2006/math" xmlns:v="urn:schemas-microsoft-com:vml" xmlns:wp14="http://schemas.microsoft.com/office/word/2010/wordprocessingDrawing" xmlns:wp="http://schemas.openxmlformats.org/drawingml/2006/wordprocessingDrawing" xmlns:w10="urn:schemas-microsoft-com:office:word" xmlns:w="http://schemas.openxmlformats.org/wordprocessingml/2006/main" xmlns:w14="http://schemas.microsoft.com/office/word/2010/wordml" xmlns:w15="http://schemas.microsoft.com/office/word/2012/wordml" xmlns:w16cex="http://schemas.microsoft.com/office/word/2018/wordml/cex" xmlns:w16cid="http://schemas.microsoft.com/office/word/2016/wordml/cid" xmlns:w16="http://schemas.microsoft.com/office/word/2018/wordml" xmlns:w16du="http://schemas.microsoft.com/office/word/2023/wordml/word16du" xmlns:w16sdtdh="http://schemas.microsoft.com/office/word/2020/wordml/sdtdatahash" xmlns:w16sdtfl="http://schemas.microsoft.com/office/word/2024/wordml/sdtformatlock" xmlns:w16se="http://schemas.microsoft.com/office/word/2015/wordml/symex" xmlns:wpg="http://schemas.microsoft.com/office/word/2010/wordprocessingGroup" xmlns:wpi="http://schemas.microsoft.com/office/word/2010/wordprocessingInk" xmlns:wne="http://schemas.microsoft.com/office/word/2006/wordml" xmlns:wps="http://schemas.microsoft.com/office/word/2010/wordprocessingShape" mc:Ignorable="w14 w15 w16se w16cid w16 w16cex w16sdtdh w16sdtfl w16du wp14">
   <w:p>
     <w:pPr>
       <w:pStyle w:val="Encabezado"/>
@@ -3918,7 +3957,7 @@
 </file>
 
 <file path=word/numbering.xml><?xml version="1.0" encoding="utf-8"?>
-<w:numbering xmlns:wpc="http://schemas.microsoft.com/office/word/2010/wordprocessingCanvas" xmlns:cx="http://schemas.microsoft.com/office/drawing/2014/chartex" xmlns:cx1="http://schemas.microsoft.com/office/drawing/2015/9/8/chartex" xmlns:cx2="http://schemas.microsoft.com/office/drawing/2015/10/21/chartex" xmlns:cx3="http://schemas.microsoft.com/office/drawing/2016/5/9/chartex" xmlns:cx4="http://schemas.microsoft.com/office/drawing/2016/5/10/chartex" xmlns:cx5="http://schemas.microsoft.com/office/drawing/2016/5/11/chartex" xmlns:cx6="http://schemas.microsoft.com/office/drawing/2016/5/12/chartex" xmlns:cx7="http://schemas.microsoft.com/office/drawing/2016/5/13/chartex" xmlns:cx8="http://schemas.microsoft.com/office/drawing/2016/5/14/chartex" xmlns:mc="http://schemas.openxmlformats.org/markup-compatibility/2006" xmlns:aink="http://schemas.microsoft.com/office/drawing/2016/ink" xmlns:am3d="http://schemas.microsoft.com/office/drawing/2017/model3d" xmlns:o="urn:schemas-microsoft-com:office:office" xmlns:r="http://schemas.openxmlformats.org/officeDocument/2006/relationships" xmlns:m="http://schemas.openxmlformats.org/officeDocument/2006/math" xmlns:v="urn:schemas-microsoft-com:vml" xmlns:wp14="http://schemas.microsoft.com/office/word/2010/wordprocessingDrawing" xmlns:wp="http://schemas.openxmlformats.org/drawingml/2006/wordprocessingDrawing" xmlns:w10="urn:schemas-microsoft-com:office:word" xmlns:w="http://schemas.openxmlformats.org/wordprocessingml/2006/main" xmlns:w14="http://schemas.microsoft.com/office/word/2010/wordml" xmlns:w15="http://schemas.microsoft.com/office/word/2012/wordml" xmlns:w16cex="http://schemas.microsoft.com/office/word/2018/wordml/cex" xmlns:w16cid="http://schemas.microsoft.com/office/word/2016/wordml/cid" xmlns:w16="http://schemas.microsoft.com/office/word/2018/wordml" xmlns:w16sdtdh="http://schemas.microsoft.com/office/word/2020/wordml/sdtdatahash" xmlns:w16se="http://schemas.microsoft.com/office/word/2015/wordml/symex" xmlns:wpg="http://schemas.microsoft.com/office/word/2010/wordprocessingGroup" xmlns:wpi="http://schemas.microsoft.com/office/word/2010/wordprocessingInk" xmlns:wne="http://schemas.microsoft.com/office/word/2006/wordml" xmlns:wps="http://schemas.microsoft.com/office/word/2010/wordprocessingShape" mc:Ignorable="w14 w15 w16se w16cid w16 w16cex w16sdtdh wp14">
+<w:numbering xmlns:wpc="http://schemas.microsoft.com/office/word/2010/wordprocessingCanvas" xmlns:cx="http://schemas.microsoft.com/office/drawing/2014/chartex" xmlns:cx1="http://schemas.microsoft.com/office/drawing/2015/9/8/chartex" xmlns:cx2="http://schemas.microsoft.com/office/drawing/2015/10/21/chartex" xmlns:cx3="http://schemas.microsoft.com/office/drawing/2016/5/9/chartex" xmlns:cx4="http://schemas.microsoft.com/office/drawing/2016/5/10/chartex" xmlns:cx5="http://schemas.microsoft.com/office/drawing/2016/5/11/chartex" xmlns:cx6="http://schemas.microsoft.com/office/drawing/2016/5/12/chartex" xmlns:cx7="http://schemas.microsoft.com/office/drawing/2016/5/13/chartex" xmlns:cx8="http://schemas.microsoft.com/office/drawing/2016/5/14/chartex" xmlns:mc="http://schemas.openxmlformats.org/markup-compatibility/2006" xmlns:aink="http://schemas.microsoft.com/office/drawing/2016/ink" xmlns:am3d="http://schemas.microsoft.com/office/drawing/2017/model3d" xmlns:o="urn:schemas-microsoft-com:office:office" xmlns:oel="http://schemas.microsoft.com/office/2019/extlst" xmlns:r="http://schemas.openxmlformats.org/officeDocument/2006/relationships" xmlns:m="http://schemas.openxmlformats.org/officeDocument/2006/math" xmlns:v="urn:schemas-microsoft-com:vml" xmlns:wp14="http://schemas.microsoft.com/office/word/2010/wordprocessingDrawing" xmlns:wp="http://schemas.openxmlformats.org/drawingml/2006/wordprocessingDrawing" xmlns:w10="urn:schemas-microsoft-com:office:word" xmlns:w="http://schemas.openxmlformats.org/wordprocessingml/2006/main" xmlns:w14="http://schemas.microsoft.com/office/word/2010/wordml" xmlns:w15="http://schemas.microsoft.com/office/word/2012/wordml" xmlns:w16cex="http://schemas.microsoft.com/office/word/2018/wordml/cex" xmlns:w16cid="http://schemas.microsoft.com/office/word/2016/wordml/cid" xmlns:w16="http://schemas.microsoft.com/office/word/2018/wordml" xmlns:w16du="http://schemas.microsoft.com/office/word/2023/wordml/word16du" xmlns:w16sdtdh="http://schemas.microsoft.com/office/word/2020/wordml/sdtdatahash" xmlns:w16sdtfl="http://schemas.microsoft.com/office/word/2024/wordml/sdtformatlock" xmlns:w16se="http://schemas.microsoft.com/office/word/2015/wordml/symex" xmlns:wpg="http://schemas.microsoft.com/office/word/2010/wordprocessingGroup" xmlns:wpi="http://schemas.microsoft.com/office/word/2010/wordprocessingInk" xmlns:wne="http://schemas.microsoft.com/office/word/2006/wordml" xmlns:wps="http://schemas.microsoft.com/office/word/2010/wordprocessingShape" mc:Ignorable="w14 w15 w16se w16cid w16 w16cex w16sdtdh w16sdtfl w16du wp14">
   <w:abstractNum w:abstractNumId="0" w15:restartNumberingAfterBreak="0">
     <w:nsid w:val="03B97891"/>
     <w:multiLevelType w:val="multilevel"/>
@@ -8184,113 +8223,113 @@
       </w:rPr>
     </w:lvl>
   </w:abstractNum>
-  <w:num w:numId="1">
+  <w:num w:numId="1" w16cid:durableId="579411662">
     <w:abstractNumId w:val="0"/>
   </w:num>
-  <w:num w:numId="2">
+  <w:num w:numId="2" w16cid:durableId="828248570">
     <w:abstractNumId w:val="6"/>
   </w:num>
-  <w:num w:numId="3">
+  <w:num w:numId="3" w16cid:durableId="1503593610">
     <w:abstractNumId w:val="20"/>
   </w:num>
-  <w:num w:numId="4">
+  <w:num w:numId="4" w16cid:durableId="710496571">
     <w:abstractNumId w:val="28"/>
   </w:num>
-  <w:num w:numId="5">
+  <w:num w:numId="5" w16cid:durableId="1437293441">
     <w:abstractNumId w:val="23"/>
   </w:num>
-  <w:num w:numId="6">
+  <w:num w:numId="6" w16cid:durableId="1103500320">
     <w:abstractNumId w:val="12"/>
   </w:num>
-  <w:num w:numId="7">
+  <w:num w:numId="7" w16cid:durableId="21102912">
     <w:abstractNumId w:val="29"/>
   </w:num>
-  <w:num w:numId="8">
+  <w:num w:numId="8" w16cid:durableId="789979095">
     <w:abstractNumId w:val="13"/>
   </w:num>
-  <w:num w:numId="9">
+  <w:num w:numId="9" w16cid:durableId="898513900">
     <w:abstractNumId w:val="19"/>
   </w:num>
-  <w:num w:numId="10">
+  <w:num w:numId="10" w16cid:durableId="373116083">
     <w:abstractNumId w:val="26"/>
   </w:num>
-  <w:num w:numId="11">
+  <w:num w:numId="11" w16cid:durableId="1290555625">
     <w:abstractNumId w:val="9"/>
   </w:num>
-  <w:num w:numId="12">
+  <w:num w:numId="12" w16cid:durableId="1535655462">
     <w:abstractNumId w:val="3"/>
   </w:num>
-  <w:num w:numId="13">
+  <w:num w:numId="13" w16cid:durableId="1248645">
     <w:abstractNumId w:val="2"/>
   </w:num>
-  <w:num w:numId="14">
+  <w:num w:numId="14" w16cid:durableId="1297251251">
     <w:abstractNumId w:val="4"/>
   </w:num>
-  <w:num w:numId="15">
+  <w:num w:numId="15" w16cid:durableId="97023911">
     <w:abstractNumId w:val="25"/>
   </w:num>
-  <w:num w:numId="16">
+  <w:num w:numId="16" w16cid:durableId="1681464694">
     <w:abstractNumId w:val="14"/>
   </w:num>
-  <w:num w:numId="17">
+  <w:num w:numId="17" w16cid:durableId="265891508">
     <w:abstractNumId w:val="18"/>
   </w:num>
-  <w:num w:numId="18">
+  <w:num w:numId="18" w16cid:durableId="1818690778">
     <w:abstractNumId w:val="10"/>
   </w:num>
-  <w:num w:numId="19">
+  <w:num w:numId="19" w16cid:durableId="969285848">
     <w:abstractNumId w:val="32"/>
   </w:num>
-  <w:num w:numId="20">
+  <w:num w:numId="20" w16cid:durableId="1405300298">
     <w:abstractNumId w:val="33"/>
   </w:num>
-  <w:num w:numId="21">
+  <w:num w:numId="21" w16cid:durableId="882326440">
     <w:abstractNumId w:val="7"/>
   </w:num>
-  <w:num w:numId="22">
+  <w:num w:numId="22" w16cid:durableId="32318146">
     <w:abstractNumId w:val="27"/>
   </w:num>
-  <w:num w:numId="23">
+  <w:num w:numId="23" w16cid:durableId="835538179">
     <w:abstractNumId w:val="17"/>
   </w:num>
-  <w:num w:numId="24">
+  <w:num w:numId="24" w16cid:durableId="1804999693">
     <w:abstractNumId w:val="22"/>
   </w:num>
-  <w:num w:numId="25">
+  <w:num w:numId="25" w16cid:durableId="643119630">
     <w:abstractNumId w:val="24"/>
   </w:num>
-  <w:num w:numId="26">
+  <w:num w:numId="26" w16cid:durableId="1810980129">
     <w:abstractNumId w:val="16"/>
   </w:num>
-  <w:num w:numId="27">
+  <w:num w:numId="27" w16cid:durableId="99303288">
     <w:abstractNumId w:val="5"/>
   </w:num>
-  <w:num w:numId="28">
+  <w:num w:numId="28" w16cid:durableId="703168342">
     <w:abstractNumId w:val="15"/>
   </w:num>
-  <w:num w:numId="29">
+  <w:num w:numId="29" w16cid:durableId="749081931">
     <w:abstractNumId w:val="11"/>
   </w:num>
-  <w:num w:numId="30">
+  <w:num w:numId="30" w16cid:durableId="1529678532">
     <w:abstractNumId w:val="21"/>
   </w:num>
-  <w:num w:numId="31">
+  <w:num w:numId="31" w16cid:durableId="209464415">
     <w:abstractNumId w:val="8"/>
   </w:num>
-  <w:num w:numId="32">
+  <w:num w:numId="32" w16cid:durableId="1985040990">
     <w:abstractNumId w:val="30"/>
   </w:num>
-  <w:num w:numId="33">
+  <w:num w:numId="33" w16cid:durableId="1425954693">
     <w:abstractNumId w:val="31"/>
   </w:num>
-  <w:num w:numId="34">
+  <w:num w:numId="34" w16cid:durableId="200213555">
     <w:abstractNumId w:val="1"/>
   </w:num>
 </w:numbering>
 </file>
 
 <file path=word/styles.xml><?xml version="1.0" encoding="utf-8"?>
-<w:styles xmlns:mc="http://schemas.openxmlformats.org/markup-compatibility/2006" xmlns:r="http://schemas.openxmlformats.org/officeDocument/2006/relationships" xmlns:w="http://schemas.openxmlformats.org/wordprocessingml/2006/main" xmlns:w14="http://schemas.microsoft.com/office/word/2010/wordml" xmlns:w15="http://schemas.microsoft.com/office/word/2012/wordml" xmlns:w16cex="http://schemas.microsoft.com/office/word/2018/wordml/cex" xmlns:w16cid="http://schemas.microsoft.com/office/word/2016/wordml/cid" xmlns:w16="http://schemas.microsoft.com/office/word/2018/wordml" xmlns:w16sdtdh="http://schemas.microsoft.com/office/word/2020/wordml/sdtdatahash" xmlns:w16se="http://schemas.microsoft.com/office/word/2015/wordml/symex" mc:Ignorable="w14 w15 w16se w16cid w16 w16cex w16sdtdh">
+<w:styles xmlns:mc="http://schemas.openxmlformats.org/markup-compatibility/2006" xmlns:r="http://schemas.openxmlformats.org/officeDocument/2006/relationships" xmlns:w="http://schemas.openxmlformats.org/wordprocessingml/2006/main" xmlns:w14="http://schemas.microsoft.com/office/word/2010/wordml" xmlns:w15="http://schemas.microsoft.com/office/word/2012/wordml" xmlns:w16cex="http://schemas.microsoft.com/office/word/2018/wordml/cex" xmlns:w16cid="http://schemas.microsoft.com/office/word/2016/wordml/cid" xmlns:w16="http://schemas.microsoft.com/office/word/2018/wordml" xmlns:w16du="http://schemas.microsoft.com/office/word/2023/wordml/word16du" xmlns:w16sdtdh="http://schemas.microsoft.com/office/word/2020/wordml/sdtdatahash" xmlns:w16sdtfl="http://schemas.microsoft.com/office/word/2024/wordml/sdtformatlock" xmlns:w16se="http://schemas.microsoft.com/office/word/2015/wordml/symex" mc:Ignorable="w14 w15 w16se w16cid w16 w16cex w16sdtdh w16sdtfl w16du">
   <w:docDefaults>
     <w:rPrDefault>
       <w:rPr>

</xml_diff>